<commit_message>
feat: template Berita Acara diperbarui (5 agama, format modern)
Template diperbarui user: header + tanda tangan pejabat/saksi/stempel + nomor
surat, dan teks sumpah per agama (Islam/Kristen/Budha/Hindu/Katolik) beserta
nama rohaniwan masing-masing.

Semua gambar kini format DrawingML modern (bukan VML lama) agar LibreOffice/
Gotenberg merender tanpa kotak berbingkai menumpuk teks.

Terverifikasi render kelima template: 1 halaman, Arial, 0 sisa placeholder,
TTD pejabat/saksi rapi, dan stamp TTD peserta mendarat tepat di kolom
'Yang mengangkat sumpah' (uji via pipeline generate peserta sungguhan).

Co-Authored-By: Claude Opus 4.8 <noreply@anthropic.com>
</commit_message>
<xml_diff>
--- a/templates/CEK/Kristen.docx
+++ b/templates/CEK/Kristen.docx
@@ -619,7 +619,23 @@
           <w:rFonts w:ascii="Arial" w:hAnsi="Arial" w:cs="Arial"/>
           <w:color w:val="000000"/>
         </w:rPr>
-        <w:t>/         /204.3/202</w:t>
+        <w:t>/</w:t>
+      </w:r>
+      <w:r>
+        <w:rPr>
+          <w:rStyle w:val="MSGENFONTSTYLENAMETEMPLATEROLENUMBERMSGENFONTSTYLENAMEBYROLETEXT2"/>
+          <w:rFonts w:ascii="Arial" w:hAnsi="Arial" w:cs="Arial"/>
+          <w:color w:val="000000"/>
+        </w:rPr>
+        <w:t>5109</w:t>
+      </w:r>
+      <w:r>
+        <w:rPr>
+          <w:rStyle w:val="MSGENFONTSTYLENAMETEMPLATEROLENUMBERMSGENFONTSTYLENAMEBYROLETEXT2"/>
+          <w:rFonts w:ascii="Arial" w:hAnsi="Arial" w:cs="Arial"/>
+          <w:color w:val="000000"/>
+        </w:rPr>
+        <w:t>/204.3/202</w:t>
       </w:r>
       <w:r>
         <w:rPr>
@@ -2348,6 +2364,7 @@
           <w:lang w:val="en-US"/>
         </w:rPr>
       </w:pPr>
+      <w:proofErr w:type="spellStart"/>
       <w:r>
         <w:rPr>
           <w:rStyle w:val="MSGENFONTSTYLENAMETEMPLATEROLENUMBERMSGENFONTSTYLENAMEBYROLETEXT3"/>
@@ -2360,7 +2377,112 @@
           <w:sz w:val="22"/>
           <w:szCs w:val="22"/>
         </w:rPr>
-        <w:t xml:space="preserve">bahwa saya, akan bekerja dengan </w:t>
+        <w:t>bahwa</w:t>
+      </w:r>
+      <w:proofErr w:type="spellEnd"/>
+      <w:r>
+        <w:rPr>
+          <w:rStyle w:val="MSGENFONTSTYLENAMETEMPLATEROLENUMBERMSGENFONTSTYLENAMEBYROLETEXT3"/>
+          <w:rFonts w:ascii="Arial" w:hAnsi="Arial" w:cs="Arial"/>
+          <w:b/>
+          <w:bCs/>
+          <w:i/>
+          <w:iCs/>
+          <w:color w:val="000000"/>
+          <w:sz w:val="22"/>
+          <w:szCs w:val="22"/>
+        </w:rPr>
+        <w:t xml:space="preserve"> </w:t>
+      </w:r>
+      <w:proofErr w:type="spellStart"/>
+      <w:r>
+        <w:rPr>
+          <w:rStyle w:val="MSGENFONTSTYLENAMETEMPLATEROLENUMBERMSGENFONTSTYLENAMEBYROLETEXT3"/>
+          <w:rFonts w:ascii="Arial" w:hAnsi="Arial" w:cs="Arial"/>
+          <w:b/>
+          <w:bCs/>
+          <w:i/>
+          <w:iCs/>
+          <w:color w:val="000000"/>
+          <w:sz w:val="22"/>
+          <w:szCs w:val="22"/>
+        </w:rPr>
+        <w:t>saya</w:t>
+      </w:r>
+      <w:proofErr w:type="spellEnd"/>
+      <w:r>
+        <w:rPr>
+          <w:rStyle w:val="MSGENFONTSTYLENAMETEMPLATEROLENUMBERMSGENFONTSTYLENAMEBYROLETEXT3"/>
+          <w:rFonts w:ascii="Arial" w:hAnsi="Arial" w:cs="Arial"/>
+          <w:b/>
+          <w:bCs/>
+          <w:i/>
+          <w:iCs/>
+          <w:color w:val="000000"/>
+          <w:sz w:val="22"/>
+          <w:szCs w:val="22"/>
+        </w:rPr>
+        <w:t xml:space="preserve">, </w:t>
+      </w:r>
+      <w:proofErr w:type="spellStart"/>
+      <w:r>
+        <w:rPr>
+          <w:rStyle w:val="MSGENFONTSTYLENAMETEMPLATEROLENUMBERMSGENFONTSTYLENAMEBYROLETEXT3"/>
+          <w:rFonts w:ascii="Arial" w:hAnsi="Arial" w:cs="Arial"/>
+          <w:b/>
+          <w:bCs/>
+          <w:i/>
+          <w:iCs/>
+          <w:color w:val="000000"/>
+          <w:sz w:val="22"/>
+          <w:szCs w:val="22"/>
+        </w:rPr>
+        <w:t>akan</w:t>
+      </w:r>
+      <w:proofErr w:type="spellEnd"/>
+      <w:r>
+        <w:rPr>
+          <w:rStyle w:val="MSGENFONTSTYLENAMETEMPLATEROLENUMBERMSGENFONTSTYLENAMEBYROLETEXT3"/>
+          <w:rFonts w:ascii="Arial" w:hAnsi="Arial" w:cs="Arial"/>
+          <w:b/>
+          <w:bCs/>
+          <w:i/>
+          <w:iCs/>
+          <w:color w:val="000000"/>
+          <w:sz w:val="22"/>
+          <w:szCs w:val="22"/>
+        </w:rPr>
+        <w:t xml:space="preserve"> </w:t>
+      </w:r>
+      <w:proofErr w:type="spellStart"/>
+      <w:r>
+        <w:rPr>
+          <w:rStyle w:val="MSGENFONTSTYLENAMETEMPLATEROLENUMBERMSGENFONTSTYLENAMEBYROLETEXT3"/>
+          <w:rFonts w:ascii="Arial" w:hAnsi="Arial" w:cs="Arial"/>
+          <w:b/>
+          <w:bCs/>
+          <w:i/>
+          <w:iCs/>
+          <w:color w:val="000000"/>
+          <w:sz w:val="22"/>
+          <w:szCs w:val="22"/>
+        </w:rPr>
+        <w:t>bekerja</w:t>
+      </w:r>
+      <w:proofErr w:type="spellEnd"/>
+      <w:r>
+        <w:rPr>
+          <w:rStyle w:val="MSGENFONTSTYLENAMETEMPLATEROLENUMBERMSGENFONTSTYLENAMEBYROLETEXT3"/>
+          <w:rFonts w:ascii="Arial" w:hAnsi="Arial" w:cs="Arial"/>
+          <w:b/>
+          <w:bCs/>
+          <w:i/>
+          <w:iCs/>
+          <w:color w:val="000000"/>
+          <w:sz w:val="22"/>
+          <w:szCs w:val="22"/>
+        </w:rPr>
+        <w:t xml:space="preserve"> dengan </w:t>
       </w:r>
       <w:r>
         <w:rPr>
@@ -2470,32 +2592,149 @@
           <w:sz w:val="22"/>
           <w:szCs w:val="22"/>
         </w:rPr>
-        <w:t>Demikianlah berita acara pengambilan sumpah ini dibuat dengan sebenarnya untuk dapat digunakan sebagaimana mestinya.</w:t>
-      </w:r>
+        <w:t xml:space="preserve">Demikianlah berita acara pengambilan sumpah ini dibuat dengan sebenarnya untuk </w:t>
+      </w:r>
+      <w:proofErr w:type="spellStart"/>
+      <w:r>
+        <w:rPr>
+          <w:rStyle w:val="MSGENFONTSTYLENAMETEMPLATEROLEMSGENFONTSTYLENAMEBYROLEPICTURECAPTION"/>
+          <w:rFonts w:ascii="Arial" w:hAnsi="Arial" w:cs="Arial"/>
+          <w:color w:val="000000"/>
+          <w:sz w:val="22"/>
+          <w:szCs w:val="22"/>
+        </w:rPr>
+        <w:t>dapat</w:t>
+      </w:r>
+      <w:proofErr w:type="spellEnd"/>
+      <w:r>
+        <w:rPr>
+          <w:rStyle w:val="MSGENFONTSTYLENAMETEMPLATEROLEMSGENFONTSTYLENAMEBYROLEPICTURECAPTION"/>
+          <w:rFonts w:ascii="Arial" w:hAnsi="Arial" w:cs="Arial"/>
+          <w:color w:val="000000"/>
+          <w:sz w:val="22"/>
+          <w:szCs w:val="22"/>
+        </w:rPr>
+        <w:t xml:space="preserve"> </w:t>
+      </w:r>
+      <w:proofErr w:type="spellStart"/>
+      <w:r>
+        <w:rPr>
+          <w:rStyle w:val="MSGENFONTSTYLENAMETEMPLATEROLEMSGENFONTSTYLENAMEBYROLEPICTURECAPTION"/>
+          <w:rFonts w:ascii="Arial" w:hAnsi="Arial" w:cs="Arial"/>
+          <w:color w:val="000000"/>
+          <w:sz w:val="22"/>
+          <w:szCs w:val="22"/>
+        </w:rPr>
+        <w:t>digunakan</w:t>
+      </w:r>
+      <w:proofErr w:type="spellEnd"/>
+      <w:r>
+        <w:rPr>
+          <w:rStyle w:val="MSGENFONTSTYLENAMETEMPLATEROLEMSGENFONTSTYLENAMEBYROLEPICTURECAPTION"/>
+          <w:rFonts w:ascii="Arial" w:hAnsi="Arial" w:cs="Arial"/>
+          <w:color w:val="000000"/>
+          <w:sz w:val="22"/>
+          <w:szCs w:val="22"/>
+        </w:rPr>
+        <w:t xml:space="preserve"> </w:t>
+      </w:r>
+      <w:proofErr w:type="spellStart"/>
+      <w:r>
+        <w:rPr>
+          <w:rStyle w:val="MSGENFONTSTYLENAMETEMPLATEROLEMSGENFONTSTYLENAMEBYROLEPICTURECAPTION"/>
+          <w:rFonts w:ascii="Arial" w:hAnsi="Arial" w:cs="Arial"/>
+          <w:color w:val="000000"/>
+          <w:sz w:val="22"/>
+          <w:szCs w:val="22"/>
+        </w:rPr>
+        <w:t>sebagaimana</w:t>
+      </w:r>
+      <w:proofErr w:type="spellEnd"/>
+      <w:r>
+        <w:rPr>
+          <w:rStyle w:val="MSGENFONTSTYLENAMETEMPLATEROLEMSGENFONTSTYLENAMEBYROLEPICTURECAPTION"/>
+          <w:rFonts w:ascii="Arial" w:hAnsi="Arial" w:cs="Arial"/>
+          <w:color w:val="000000"/>
+          <w:sz w:val="22"/>
+          <w:szCs w:val="22"/>
+        </w:rPr>
+        <w:t xml:space="preserve"> </w:t>
+      </w:r>
+      <w:proofErr w:type="spellStart"/>
+      <w:r>
+        <w:rPr>
+          <w:rStyle w:val="MSGENFONTSTYLENAMETEMPLATEROLEMSGENFONTSTYLENAMEBYROLEPICTURECAPTION"/>
+          <w:rFonts w:ascii="Arial" w:hAnsi="Arial" w:cs="Arial"/>
+          <w:color w:val="000000"/>
+          <w:sz w:val="22"/>
+          <w:szCs w:val="22"/>
+        </w:rPr>
+        <w:t>mestinya</w:t>
+      </w:r>
+      <w:proofErr w:type="spellEnd"/>
+      <w:r>
+        <w:rPr>
+          <w:rStyle w:val="MSGENFONTSTYLENAMETEMPLATEROLEMSGENFONTSTYLENAMEBYROLEPICTURECAPTION"/>
+          <w:rFonts w:ascii="Arial" w:hAnsi="Arial" w:cs="Arial"/>
+          <w:color w:val="000000"/>
+          <w:sz w:val="22"/>
+          <w:szCs w:val="22"/>
+        </w:rPr>
+        <w:t>.</w:t>
+      </w:r>
+    </w:p>
+    <w:p>
+      <w:pPr>
+        <w:pStyle w:val="MSGENFONTSTYLENAMETEMPLATEROLEMSGENFONTSTYLENAMEBYROLEPICTURECAPTION1"/>
+        <w:shd w:val="clear" w:color="auto" w:fill="auto"/>
+        <w:spacing w:line="240" w:lineRule="auto"/>
+        <w:ind w:left="142" w:right="187"/>
+        <w:jc w:val="both"/>
+        <w:rPr>
+          <w:rStyle w:val="MSGENFONTSTYLENAMETEMPLATEROLEMSGENFONTSTYLENAMEBYROLEPICTURECAPTION"/>
+          <w:rFonts w:ascii="Arial" w:hAnsi="Arial" w:cs="Arial"/>
+          <w:color w:val="000000"/>
+          <w:sz w:val="22"/>
+          <w:szCs w:val="22"/>
+        </w:rPr>
+      </w:pPr>
+    </w:p>
+    <w:p>
+      <w:pPr>
+        <w:pStyle w:val="MSGENFONTSTYLENAMETEMPLATEROLEMSGENFONTSTYLENAMEBYROLEPICTURECAPTION1"/>
+        <w:shd w:val="clear" w:color="auto" w:fill="auto"/>
+        <w:spacing w:line="240" w:lineRule="auto"/>
+        <w:ind w:left="142" w:right="46"/>
+        <w:jc w:val="both"/>
+        <w:rPr>
+          <w:rFonts w:ascii="Arial" w:hAnsi="Arial" w:cs="Arial"/>
+        </w:rPr>
+      </w:pPr>
     </w:p>
     <w:tbl>
       <w:tblPr>
-        <w:tblW w:w="21162" w:type="dxa"/>
+        <w:tblW w:w="21433" w:type="dxa"/>
+        <w:tblInd w:w="-426" w:type="dxa"/>
+        <w:tblLayout w:type="fixed"/>
         <w:tblLook w:val="04A0" w:firstRow="1" w:lastRow="0" w:firstColumn="1" w:lastColumn="0" w:noHBand="0" w:noVBand="1"/>
       </w:tblPr>
       <w:tblGrid>
-        <w:gridCol w:w="5265"/>
-        <w:gridCol w:w="5367"/>
-        <w:gridCol w:w="5265"/>
-        <w:gridCol w:w="5265"/>
+        <w:gridCol w:w="5636"/>
+        <w:gridCol w:w="5267"/>
+        <w:gridCol w:w="5263"/>
+        <w:gridCol w:w="5267"/>
       </w:tblGrid>
       <w:tr>
         <w:trPr>
-          <w:gridAfter w:val="1"/>
-          <w:wAfter w:w="5265" w:type="dxa"/>
           <w:trHeight w:val="2221"/>
         </w:trPr>
         <w:tc>
           <w:tcPr>
-            <w:tcW w:w="5265" w:type="dxa"/>
+            <w:tcW w:w="5636" w:type="dxa"/>
           </w:tcPr>
           <w:p>
             <w:pPr>
+              <w:snapToGrid w:val="0"/>
               <w:jc w:val="center"/>
               <w:rPr>
                 <w:rFonts w:ascii="Arial" w:hAnsi="Arial" w:cs="Arial"/>
@@ -2506,25 +2745,21 @@
             </w:pPr>
             <w:r>
               <w:rPr>
-                <w:rFonts w:ascii="Arial" w:hAnsi="Arial" w:cs="Arial"/>
                 <w:noProof/>
-                <w:sz w:val="22"/>
-                <w:szCs w:val="22"/>
-                <w:lang w:val="id-ID"/>
               </w:rPr>
               <w:drawing>
-                <wp:anchor distT="0" distB="0" distL="114300" distR="114300" simplePos="0" relativeHeight="251658240" behindDoc="0" locked="0" layoutInCell="1" allowOverlap="1" wp14:anchorId="08CE9484" wp14:editId="604A6962">
+                <wp:anchor distT="0" distB="0" distL="114300" distR="114300" simplePos="0" relativeHeight="251665408" behindDoc="0" locked="0" layoutInCell="1" allowOverlap="1" wp14:anchorId="1BA035E0" wp14:editId="03CE1A7A">
                   <wp:simplePos x="0" y="0"/>
                   <wp:positionH relativeFrom="column">
-                    <wp:posOffset>4972685</wp:posOffset>
+                    <wp:posOffset>3151505</wp:posOffset>
                   </wp:positionH>
                   <wp:positionV relativeFrom="paragraph">
-                    <wp:posOffset>8418195</wp:posOffset>
+                    <wp:posOffset>67310</wp:posOffset>
                   </wp:positionV>
-                  <wp:extent cx="1222375" cy="1806575"/>
+                  <wp:extent cx="1337945" cy="1449705"/>
                   <wp:effectExtent l="0" t="0" r="0" b="0"/>
                   <wp:wrapNone/>
-                  <wp:docPr id="1" name="Picture 1"/>
+                  <wp:docPr id="953220891" name="Picture 20"/>
                   <wp:cNvGraphicFramePr>
                     <a:graphicFrameLocks xmlns:a="http://schemas.openxmlformats.org/drawingml/2006/main" noChangeAspect="1"/>
                   </wp:cNvGraphicFramePr>
@@ -2532,31 +2767,20 @@
                     <a:graphicData uri="http://schemas.openxmlformats.org/drawingml/2006/picture">
                       <pic:pic xmlns:pic="http://schemas.openxmlformats.org/drawingml/2006/picture">
                         <pic:nvPicPr>
-                          <pic:cNvPr id="0" name="Picture 2"/>
+                          <pic:cNvPr id="0" name="Picture 17"/>
                           <pic:cNvPicPr>
                             <a:picLocks noChangeAspect="1" noChangeArrowheads="1"/>
                           </pic:cNvPicPr>
                         </pic:nvPicPr>
                         <pic:blipFill>
                           <a:blip r:embed="rId9" cstate="print">
-                            <a:clrChange>
-                              <a:clrFrom>
-                                <a:srgbClr val="FFFFFF"/>
-                              </a:clrFrom>
-                              <a:clrTo>
-                                <a:srgbClr val="FFFFFF">
-                                  <a:alpha val="0"/>
-                                </a:srgbClr>
-                              </a:clrTo>
-                            </a:clrChange>
-                            <a:lum contrast="60000"/>
                             <a:extLst>
                               <a:ext uri="{28A0092B-C50C-407E-A947-70E740481C1C}">
                                 <a14:useLocalDpi xmlns:a14="http://schemas.microsoft.com/office/drawing/2010/main" val="0"/>
                               </a:ext>
                             </a:extLst>
                           </a:blip>
-                          <a:srcRect/>
+                          <a:srcRect l="18018" t="25609" r="18709" b="22972"/>
                           <a:stretch>
                             <a:fillRect/>
                           </a:stretch>
@@ -2564,15 +2788,12 @@
                         <pic:spPr bwMode="auto">
                           <a:xfrm>
                             <a:off x="0" y="0"/>
-                            <a:ext cx="1222375" cy="1806575"/>
+                            <a:ext cx="1337945" cy="1449705"/>
                           </a:xfrm>
                           <a:prstGeom prst="rect">
                             <a:avLst/>
                           </a:prstGeom>
                           <a:noFill/>
-                          <a:ln>
-                            <a:noFill/>
-                          </a:ln>
                         </pic:spPr>
                       </pic:pic>
                     </a:graphicData>
@@ -2597,15 +2818,6 @@
                 <w:lang w:val="id-ID"/>
               </w:rPr>
             </w:pPr>
-            <w:r>
-              <w:rPr>
-                <w:rFonts w:ascii="Arial" w:hAnsi="Arial" w:cs="Arial"/>
-                <w:sz w:val="22"/>
-                <w:szCs w:val="22"/>
-                <w:lang w:val="id-ID"/>
-              </w:rPr>
-              <w:t>Pegawai Negeri Sipil</w:t>
-            </w:r>
           </w:p>
           <w:p>
             <w:pPr>
@@ -2614,7 +2826,7 @@
                 <w:rFonts w:ascii="Arial" w:hAnsi="Arial" w:cs="Arial"/>
                 <w:sz w:val="22"/>
                 <w:szCs w:val="22"/>
-                <w:lang w:val="en-AU"/>
+                <w:lang w:val="id-ID"/>
               </w:rPr>
             </w:pPr>
             <w:r>
@@ -2624,16 +2836,7 @@
                 <w:szCs w:val="22"/>
                 <w:lang w:val="id-ID"/>
               </w:rPr>
-              <w:t>Yang mengangkat sumpah</w:t>
-            </w:r>
-            <w:r>
-              <w:rPr>
-                <w:rFonts w:ascii="Arial" w:hAnsi="Arial" w:cs="Arial"/>
-                <w:sz w:val="22"/>
-                <w:szCs w:val="22"/>
-                <w:lang w:val="en-AU"/>
-              </w:rPr>
-              <w:t>,</w:t>
+              <w:t>Pegawai Negeri Sipil</w:t>
             </w:r>
           </w:p>
           <w:p>
@@ -2641,8 +2844,35 @@
               <w:jc w:val="center"/>
               <w:rPr>
                 <w:rFonts w:ascii="Arial" w:hAnsi="Arial" w:cs="Arial"/>
-                <w:sz w:val="22"/>
-                <w:szCs w:val="22"/>
+              </w:rPr>
+            </w:pPr>
+            <w:r>
+              <w:rPr>
+                <w:rFonts w:ascii="Arial" w:hAnsi="Arial" w:cs="Arial"/>
+                <w:sz w:val="22"/>
+                <w:szCs w:val="22"/>
+                <w:lang w:val="id-ID"/>
+              </w:rPr>
+              <w:t>Yang mengangkat sumpah</w:t>
+            </w:r>
+            <w:r>
+              <w:rPr>
+                <w:rFonts w:ascii="Arial" w:hAnsi="Arial" w:cs="Arial"/>
+                <w:sz w:val="22"/>
+                <w:szCs w:val="22"/>
+                <w:lang w:val="en-AU"/>
+              </w:rPr>
+              <w:t>,</w:t>
+            </w:r>
+          </w:p>
+          <w:p>
+            <w:pPr>
+              <w:jc w:val="center"/>
+              <w:rPr>
+                <w:rFonts w:ascii="Arial" w:hAnsi="Arial" w:cs="Arial"/>
+                <w:sz w:val="22"/>
+                <w:szCs w:val="22"/>
+                <w:lang w:val="en-AU"/>
               </w:rPr>
             </w:pPr>
           </w:p>
@@ -2659,8 +2889,17 @@
             <w:pPr>
               <w:rPr>
                 <w:rFonts w:ascii="Arial" w:hAnsi="Arial" w:cs="Arial"/>
-                <w:sz w:val="40"/>
-                <w:szCs w:val="40"/>
+                <w:sz w:val="16"/>
+                <w:szCs w:val="16"/>
+              </w:rPr>
+            </w:pPr>
+          </w:p>
+          <w:p>
+            <w:pPr>
+              <w:rPr>
+                <w:rFonts w:ascii="Arial" w:hAnsi="Arial" w:cs="Arial"/>
+                <w:sz w:val="22"/>
+                <w:szCs w:val="22"/>
               </w:rPr>
             </w:pPr>
           </w:p>
@@ -2672,7 +2911,7 @@
                 <w:sz w:val="22"/>
                 <w:szCs w:val="22"/>
                 <w:u w:val="single"/>
-                <w:lang w:val="id-ID"/>
+                <w:shd w:val="clear" w:color="auto" w:fill="FFFFFF"/>
               </w:rPr>
             </w:pPr>
             <w:r>
@@ -2683,17 +2922,29 @@
                 <w:u w:val="single"/>
                 <w:shd w:val="clear" w:color="auto" w:fill="FFFFFF"/>
               </w:rPr>
-              <w:t>{nama_diambil_sumpah}</w:t>
-            </w:r>
+              <w:t>{</w:t>
+            </w:r>
+            <w:proofErr w:type="spellStart"/>
             <w:r>
               <w:rPr>
                 <w:rFonts w:ascii="Arial" w:hAnsi="Arial" w:cs="Arial"/>
                 <w:sz w:val="22"/>
                 <w:szCs w:val="22"/>
                 <w:u w:val="single"/>
-                <w:lang w:val="id-ID"/>
-              </w:rPr>
-              <w:t xml:space="preserve"> </w:t>
+                <w:shd w:val="clear" w:color="auto" w:fill="FFFFFF"/>
+              </w:rPr>
+              <w:t>nama_diambil_sumpah</w:t>
+            </w:r>
+            <w:proofErr w:type="spellEnd"/>
+            <w:r>
+              <w:rPr>
+                <w:rFonts w:ascii="Arial" w:hAnsi="Arial" w:cs="Arial"/>
+                <w:sz w:val="22"/>
+                <w:szCs w:val="22"/>
+                <w:u w:val="single"/>
+                <w:shd w:val="clear" w:color="auto" w:fill="FFFFFF"/>
+              </w:rPr>
+              <w:t>}</w:t>
             </w:r>
           </w:p>
           <w:p>
@@ -2707,84 +2958,21 @@
             </w:pPr>
             <w:r>
               <w:rPr>
-                <w:rFonts w:ascii="Arial" w:hAnsi="Arial" w:cs="Arial"/>
-                <w:sz w:val="22"/>
-                <w:szCs w:val="22"/>
-                <w:lang w:val="id-ID"/>
-              </w:rPr>
-              <w:t>N</w:t>
-            </w:r>
-            <w:r>
-              <w:rPr>
-                <w:rFonts w:ascii="Arial" w:hAnsi="Arial" w:cs="Arial"/>
-                <w:sz w:val="22"/>
-                <w:szCs w:val="22"/>
-              </w:rPr>
-              <w:t>IP</w:t>
-            </w:r>
-            <w:r>
-              <w:rPr>
-                <w:rFonts w:ascii="Arial" w:hAnsi="Arial" w:cs="Arial"/>
-                <w:sz w:val="22"/>
-                <w:szCs w:val="22"/>
-                <w:lang w:val="id-ID"/>
-              </w:rPr>
-              <w:t>.</w:t>
-            </w:r>
-            <w:r>
-              <w:rPr>
-                <w:rFonts w:ascii="Arial" w:hAnsi="Arial" w:cs="Arial"/>
-                <w:sz w:val="22"/>
-                <w:szCs w:val="22"/>
-              </w:rPr>
-              <w:t xml:space="preserve"> </w:t>
-            </w:r>
-            <w:r>
-              <w:rPr>
-                <w:rFonts w:ascii="Arial" w:hAnsi="Arial" w:cs="Arial"/>
-                <w:sz w:val="22"/>
-                <w:szCs w:val="22"/>
-                <w:shd w:val="clear" w:color="auto" w:fill="FFFFFF"/>
-              </w:rPr>
-              <w:t>{nip_diambil_sumpah}</w:t>
-            </w:r>
-          </w:p>
-        </w:tc>
-        <w:tc>
-          <w:tcPr>
-            <w:tcW w:w="5367" w:type="dxa"/>
-          </w:tcPr>
-          <w:p>
-            <w:pPr>
-              <w:jc w:val="center"/>
-              <w:rPr>
-                <w:rFonts w:ascii="Arial" w:hAnsi="Arial" w:cs="Arial"/>
-                <w:sz w:val="22"/>
-                <w:szCs w:val="22"/>
-                <w:lang w:val="id-ID"/>
-              </w:rPr>
-            </w:pPr>
-            <w:r>
-              <w:rPr>
-                <w:rFonts w:ascii="Arial" w:hAnsi="Arial" w:cs="Arial"/>
-                <w:b/>
                 <w:noProof/>
-                <w:sz w:val="44"/>
-                <w:szCs w:val="44"/>
               </w:rPr>
               <w:drawing>
-                <wp:anchor distT="0" distB="0" distL="114300" distR="114300" simplePos="0" relativeHeight="251661312" behindDoc="0" locked="0" layoutInCell="1" allowOverlap="1" wp14:anchorId="6DE2A8E9" wp14:editId="79F352B0">
+                <wp:anchor distT="0" distB="0" distL="114300" distR="114300" simplePos="0" relativeHeight="251666432" behindDoc="0" locked="0" layoutInCell="1" allowOverlap="1" wp14:anchorId="6C3F9270" wp14:editId="5EF9DA4B">
                   <wp:simplePos x="0" y="0"/>
                   <wp:positionH relativeFrom="column">
-                    <wp:posOffset>3703320</wp:posOffset>
+                    <wp:posOffset>684530</wp:posOffset>
                   </wp:positionH>
                   <wp:positionV relativeFrom="paragraph">
-                    <wp:posOffset>8397240</wp:posOffset>
+                    <wp:posOffset>172720</wp:posOffset>
                   </wp:positionV>
-                  <wp:extent cx="1390650" cy="1390650"/>
+                  <wp:extent cx="1800860" cy="1128395"/>
                   <wp:effectExtent l="0" t="0" r="0" b="0"/>
                   <wp:wrapNone/>
-                  <wp:docPr id="4" name="Picture 4"/>
+                  <wp:docPr id="732756328" name="Picture 19"/>
                   <wp:cNvGraphicFramePr>
                     <a:graphicFrameLocks xmlns:a="http://schemas.openxmlformats.org/drawingml/2006/main" noChangeAspect="1"/>
                   </wp:cNvGraphicFramePr>
@@ -2792,7 +2980,7 @@
                     <a:graphicData uri="http://schemas.openxmlformats.org/drawingml/2006/picture">
                       <pic:pic xmlns:pic="http://schemas.openxmlformats.org/drawingml/2006/picture">
                         <pic:nvPicPr>
-                          <pic:cNvPr id="0" name="Picture 5"/>
+                          <pic:cNvPr id="0" name="Picture 3"/>
                           <pic:cNvPicPr>
                             <a:picLocks noChangeAspect="1" noChangeArrowheads="1"/>
                           </pic:cNvPicPr>
@@ -2813,23 +3001,20 @@
                         <pic:spPr bwMode="auto">
                           <a:xfrm>
                             <a:off x="0" y="0"/>
-                            <a:ext cx="1390650" cy="1390650"/>
+                            <a:ext cx="1800860" cy="1128395"/>
                           </a:xfrm>
                           <a:prstGeom prst="rect">
                             <a:avLst/>
                           </a:prstGeom>
                           <a:noFill/>
-                          <a:ln>
-                            <a:noFill/>
-                          </a:ln>
                         </pic:spPr>
                       </pic:pic>
                     </a:graphicData>
                   </a:graphic>
-                  <wp14:sizeRelH relativeFrom="page">
+                  <wp14:sizeRelH relativeFrom="margin">
                     <wp14:pctWidth>0</wp14:pctWidth>
                   </wp14:sizeRelH>
-                  <wp14:sizeRelV relativeFrom="page">
+                  <wp14:sizeRelV relativeFrom="margin">
                     <wp14:pctHeight>0</wp14:pctHeight>
                   </wp14:sizeRelV>
                 </wp:anchor>
@@ -2842,6 +3027,82 @@
                 <w:szCs w:val="22"/>
                 <w:lang w:val="id-ID"/>
               </w:rPr>
+              <w:t>N</w:t>
+            </w:r>
+            <w:r>
+              <w:rPr>
+                <w:rFonts w:ascii="Arial" w:hAnsi="Arial" w:cs="Arial"/>
+                <w:sz w:val="22"/>
+                <w:szCs w:val="22"/>
+              </w:rPr>
+              <w:t>IP</w:t>
+            </w:r>
+            <w:r>
+              <w:rPr>
+                <w:rFonts w:ascii="Arial" w:hAnsi="Arial" w:cs="Arial"/>
+                <w:sz w:val="22"/>
+                <w:szCs w:val="22"/>
+                <w:lang w:val="id-ID"/>
+              </w:rPr>
+              <w:t>.</w:t>
+            </w:r>
+            <w:r>
+              <w:rPr>
+                <w:rFonts w:ascii="Arial" w:hAnsi="Arial" w:cs="Arial"/>
+                <w:sz w:val="22"/>
+                <w:szCs w:val="22"/>
+              </w:rPr>
+              <w:t xml:space="preserve"> </w:t>
+            </w:r>
+            <w:r>
+              <w:rPr>
+                <w:rFonts w:ascii="Arial" w:hAnsi="Arial" w:cs="Arial"/>
+                <w:sz w:val="22"/>
+                <w:szCs w:val="22"/>
+                <w:shd w:val="clear" w:color="auto" w:fill="FFFFFF"/>
+              </w:rPr>
+              <w:t>{</w:t>
+            </w:r>
+            <w:proofErr w:type="spellStart"/>
+            <w:r>
+              <w:rPr>
+                <w:rFonts w:ascii="Arial" w:hAnsi="Arial" w:cs="Arial"/>
+                <w:sz w:val="22"/>
+                <w:szCs w:val="22"/>
+                <w:shd w:val="clear" w:color="auto" w:fill="FFFFFF"/>
+              </w:rPr>
+              <w:t>nip_diambil_sumpah</w:t>
+            </w:r>
+            <w:proofErr w:type="spellEnd"/>
+            <w:r>
+              <w:rPr>
+                <w:rFonts w:ascii="Arial" w:hAnsi="Arial" w:cs="Arial"/>
+                <w:sz w:val="22"/>
+                <w:szCs w:val="22"/>
+                <w:shd w:val="clear" w:color="auto" w:fill="FFFFFF"/>
+              </w:rPr>
+              <w:t>}</w:t>
+            </w:r>
+          </w:p>
+        </w:tc>
+        <w:tc>
+          <w:tcPr>
+            <w:tcW w:w="5267" w:type="dxa"/>
+          </w:tcPr>
+          <w:p>
+            <w:pPr>
+              <w:jc w:val="center"/>
+              <w:rPr>
+                <w:rFonts w:ascii="Arial" w:hAnsi="Arial" w:cs="Arial"/>
+              </w:rPr>
+            </w:pPr>
+            <w:r>
+              <w:rPr>
+                <w:rFonts w:ascii="Arial" w:hAnsi="Arial" w:cs="Arial"/>
+                <w:sz w:val="22"/>
+                <w:szCs w:val="22"/>
+                <w:lang w:val="id-ID"/>
+              </w:rPr>
               <w:t>Pejabat</w:t>
             </w:r>
           </w:p>
@@ -2850,9 +3111,6 @@
               <w:jc w:val="center"/>
               <w:rPr>
                 <w:rFonts w:ascii="Arial" w:hAnsi="Arial" w:cs="Arial"/>
-                <w:sz w:val="22"/>
-                <w:szCs w:val="22"/>
-                <w:lang w:val="en-AU"/>
               </w:rPr>
             </w:pPr>
             <w:r>
@@ -2886,325 +3144,21 @@
             </w:pPr>
             <w:r>
               <w:rPr>
-                <w:rFonts w:ascii="Arial" w:hAnsi="Arial" w:cs="Arial"/>
-                <w:sz w:val="22"/>
-                <w:szCs w:val="22"/>
-                <w:lang w:val="en-AU"/>
-              </w:rPr>
-              <w:t>Asisten Administrasi Umum</w:t>
-            </w:r>
-          </w:p>
-          <w:p>
-            <w:pPr>
-              <w:jc w:val="center"/>
-              <w:rPr>
-                <w:rFonts w:ascii="Arial" w:hAnsi="Arial" w:cs="Arial"/>
                 <w:noProof/>
-                <w:sz w:val="22"/>
-                <w:szCs w:val="22"/>
-              </w:rPr>
-            </w:pPr>
-            <w:r>
-              <w:rPr>
-                <w:rFonts w:ascii="Arial" w:hAnsi="Arial" w:cs="Arial"/>
-                <w:sz w:val="22"/>
-                <w:szCs w:val="22"/>
-                <w:lang w:val="en-AU"/>
-              </w:rPr>
-              <w:t>Sekretariat Daerah Provinsi Jawa Timur</w:t>
-            </w:r>
-          </w:p>
-          <w:p>
-            <w:pPr>
-              <w:jc w:val="center"/>
-              <w:rPr>
-                <w:rFonts w:ascii="Arial" w:hAnsi="Arial" w:cs="Arial"/>
-                <w:noProof/>
-                <w:sz w:val="22"/>
-                <w:szCs w:val="22"/>
-              </w:rPr>
-            </w:pPr>
-          </w:p>
-          <w:p>
-            <w:pPr>
-              <w:jc w:val="center"/>
-              <w:rPr>
-                <w:rFonts w:ascii="Arial" w:hAnsi="Arial" w:cs="Arial"/>
-                <w:noProof/>
-                <w:sz w:val="22"/>
-                <w:szCs w:val="22"/>
-              </w:rPr>
-            </w:pPr>
-          </w:p>
-          <w:p>
-            <w:pPr>
-              <w:jc w:val="center"/>
-              <w:rPr>
-                <w:rFonts w:ascii="Arial" w:hAnsi="Arial" w:cs="Arial"/>
-                <w:noProof/>
-                <w:sz w:val="22"/>
-                <w:szCs w:val="22"/>
-              </w:rPr>
-            </w:pPr>
-          </w:p>
-          <w:p>
-            <w:pPr>
-              <w:jc w:val="center"/>
-              <w:rPr>
-                <w:rFonts w:ascii="Arial" w:hAnsi="Arial" w:cs="Arial"/>
-                <w:noProof/>
-                <w:sz w:val="22"/>
-                <w:szCs w:val="22"/>
-              </w:rPr>
-            </w:pPr>
-          </w:p>
-          <w:p>
-            <w:pPr>
-              <w:jc w:val="center"/>
-              <w:rPr>
-                <w:rStyle w:val="MSGENFONTSTYLENAMETEMPLATEROLENUMBERMSGENFONTSTYLENAMEBYROLETEXT2"/>
-                <w:rFonts w:ascii="Arial" w:hAnsi="Arial" w:cs="Arial"/>
-                <w:sz w:val="22"/>
-                <w:szCs w:val="22"/>
-                <w:u w:val="single"/>
-              </w:rPr>
-            </w:pPr>
-            <w:r>
-              <w:rPr>
-                <w:rStyle w:val="MSGENFONTSTYLENAMETEMPLATEROLENUMBERMSGENFONTSTYLENAMEBYROLETEXT2"/>
-                <w:rFonts w:ascii="Arial" w:hAnsi="Arial" w:cs="Arial"/>
-                <w:sz w:val="22"/>
-                <w:szCs w:val="22"/>
-                <w:u w:val="single"/>
-              </w:rPr>
-              <w:t>Dr. BOBBY SOEMIARSONO, S.H, M.Si.</w:t>
-            </w:r>
-          </w:p>
-          <w:p>
-            <w:pPr>
-              <w:jc w:val="center"/>
-              <w:rPr>
-                <w:rFonts w:ascii="Arial" w:hAnsi="Arial" w:cs="Arial"/>
-                <w:sz w:val="22"/>
-                <w:szCs w:val="22"/>
-                <w:lang w:val="id-ID"/>
-              </w:rPr>
-            </w:pPr>
-            <w:r>
-              <w:rPr>
-                <w:rFonts w:ascii="Arial" w:hAnsi="Arial" w:cs="Arial"/>
-                <w:sz w:val="22"/>
-                <w:szCs w:val="22"/>
-                <w:lang w:val="id-ID"/>
-              </w:rPr>
-              <w:t>N</w:t>
-            </w:r>
-            <w:r>
-              <w:rPr>
-                <w:rFonts w:ascii="Arial" w:hAnsi="Arial" w:cs="Arial"/>
-                <w:lang w:val="id-ID"/>
-              </w:rPr>
-              <w:t>I</w:t>
-            </w:r>
-            <w:r>
-              <w:rPr>
-                <w:rFonts w:ascii="Arial" w:hAnsi="Arial" w:cs="Arial"/>
-              </w:rPr>
-              <w:t>P</w:t>
-            </w:r>
-            <w:r>
-              <w:rPr>
-                <w:rFonts w:ascii="Arial" w:hAnsi="Arial" w:cs="Arial"/>
-                <w:sz w:val="22"/>
-                <w:szCs w:val="22"/>
-              </w:rPr>
-              <w:t>. 19661031 199011 1 001</w:t>
-            </w:r>
-          </w:p>
-        </w:tc>
-        <w:tc>
-          <w:tcPr>
-            <w:tcW w:w="5265" w:type="dxa"/>
-          </w:tcPr>
-          <w:p>
-            <w:pPr>
-              <w:jc w:val="center"/>
-              <w:rPr>
-                <w:rFonts w:ascii="Arial" w:hAnsi="Arial" w:cs="Arial"/>
-                <w:sz w:val="22"/>
-                <w:szCs w:val="22"/>
-                <w:lang w:val="id-ID"/>
-              </w:rPr>
-            </w:pPr>
-            <w:r>
-              <w:rPr>
-                <w:rFonts w:ascii="Arial" w:hAnsi="Arial" w:cs="Arial"/>
-                <w:sz w:val="22"/>
-                <w:szCs w:val="22"/>
-                <w:lang w:val="id-ID"/>
-              </w:rPr>
-              <w:t>Pejabat</w:t>
-            </w:r>
-          </w:p>
-          <w:p>
-            <w:pPr>
-              <w:jc w:val="center"/>
-              <w:rPr>
-                <w:rFonts w:ascii="Arial" w:hAnsi="Arial" w:cs="Arial"/>
-                <w:sz w:val="22"/>
-                <w:szCs w:val="22"/>
-                <w:lang w:val="en-AU"/>
-              </w:rPr>
-            </w:pPr>
-            <w:r>
-              <w:rPr>
-                <w:rFonts w:ascii="Arial" w:hAnsi="Arial" w:cs="Arial"/>
-                <w:sz w:val="22"/>
-                <w:szCs w:val="22"/>
-                <w:lang w:val="id-ID"/>
-              </w:rPr>
-              <w:t>Yang mengambil sumpah</w:t>
-            </w:r>
-            <w:r>
-              <w:rPr>
-                <w:rFonts w:ascii="Arial" w:hAnsi="Arial" w:cs="Arial"/>
-                <w:sz w:val="22"/>
-                <w:szCs w:val="22"/>
-                <w:lang w:val="en-AU"/>
-              </w:rPr>
-              <w:t>,</w:t>
-            </w:r>
-          </w:p>
-          <w:p>
-            <w:pPr>
-              <w:jc w:val="center"/>
-              <w:rPr>
-                <w:rFonts w:ascii="Arial" w:hAnsi="Arial" w:cs="Arial"/>
-                <w:sz w:val="22"/>
-                <w:szCs w:val="22"/>
-                <w:lang w:val="en-AU"/>
-              </w:rPr>
-            </w:pPr>
-            <w:r>
-              <w:rPr>
-                <w:rFonts w:ascii="Arial" w:hAnsi="Arial" w:cs="Arial"/>
-                <w:sz w:val="22"/>
-                <w:szCs w:val="22"/>
-                <w:lang w:val="en-AU"/>
-              </w:rPr>
-              <w:t>Asisten Administrasi Umum</w:t>
-            </w:r>
-          </w:p>
-          <w:p>
-            <w:pPr>
-              <w:jc w:val="center"/>
-              <w:rPr>
-                <w:rFonts w:ascii="Arial" w:hAnsi="Arial" w:cs="Arial"/>
-                <w:noProof/>
-                <w:sz w:val="22"/>
-                <w:szCs w:val="22"/>
-              </w:rPr>
-            </w:pPr>
-          </w:p>
-          <w:p>
-            <w:pPr>
-              <w:jc w:val="center"/>
-              <w:rPr>
-                <w:rFonts w:ascii="Arial" w:hAnsi="Arial" w:cs="Arial"/>
-                <w:noProof/>
-                <w:sz w:val="22"/>
-                <w:szCs w:val="22"/>
-              </w:rPr>
-            </w:pPr>
-          </w:p>
-          <w:p>
-            <w:pPr>
-              <w:jc w:val="center"/>
-              <w:rPr>
-                <w:rFonts w:ascii="Arial" w:hAnsi="Arial" w:cs="Arial"/>
-                <w:sz w:val="22"/>
-                <w:szCs w:val="22"/>
-              </w:rPr>
-            </w:pPr>
-          </w:p>
-          <w:p>
-            <w:pPr>
-              <w:jc w:val="center"/>
-              <w:rPr>
-                <w:rFonts w:ascii="Arial" w:hAnsi="Arial" w:cs="Arial"/>
-                <w:sz w:val="22"/>
-                <w:szCs w:val="22"/>
-                <w:u w:val="single"/>
-              </w:rPr>
-            </w:pPr>
-            <w:r>
-              <w:rPr>
-                <w:rFonts w:ascii="Arial" w:hAnsi="Arial" w:cs="Arial"/>
-                <w:sz w:val="22"/>
-                <w:szCs w:val="22"/>
-                <w:u w:val="single"/>
-              </w:rPr>
-              <w:t>Drs. SJAICHUL GHULAM, M.M</w:t>
-            </w:r>
-          </w:p>
-          <w:p>
-            <w:pPr>
-              <w:jc w:val="center"/>
-              <w:rPr>
-                <w:rFonts w:ascii="Arial" w:hAnsi="Arial" w:cs="Arial"/>
-                <w:sz w:val="22"/>
-                <w:szCs w:val="22"/>
-              </w:rPr>
-            </w:pPr>
-            <w:r>
-              <w:rPr>
-                <w:rFonts w:ascii="Arial" w:hAnsi="Arial" w:cs="Arial"/>
-                <w:sz w:val="22"/>
-                <w:szCs w:val="22"/>
-              </w:rPr>
-              <w:t>19620803 198702 1 004</w:t>
-            </w:r>
-          </w:p>
-        </w:tc>
-      </w:tr>
-      <w:tr>
-        <w:tc>
-          <w:tcPr>
-            <w:tcW w:w="10632" w:type="dxa"/>
-            <w:gridSpan w:val="2"/>
-          </w:tcPr>
-          <w:p>
-            <w:pPr>
-              <w:tabs>
-                <w:tab w:val="center" w:pos="5157"/>
-                <w:tab w:val="left" w:pos="8265"/>
-              </w:tabs>
-              <w:rPr>
-                <w:rFonts w:ascii="Arial" w:hAnsi="Arial" w:cs="Arial"/>
-                <w:sz w:val="22"/>
-                <w:szCs w:val="22"/>
-              </w:rPr>
-            </w:pPr>
-            <w:r>
-              <w:rPr>
-                <w:rFonts w:ascii="Arial" w:hAnsi="Arial" w:cs="Arial"/>
-                <w:noProof/>
-                <w:sz w:val="22"/>
-                <w:szCs w:val="22"/>
               </w:rPr>
               <w:drawing>
-                <wp:anchor distT="0" distB="0" distL="114300" distR="114300" simplePos="0" relativeHeight="251659264" behindDoc="0" locked="0" layoutInCell="1" allowOverlap="1" wp14:anchorId="08CE9484" wp14:editId="690E2FBE">
+                <wp:anchor distT="0" distB="0" distL="114300" distR="114300" simplePos="0" relativeHeight="251664384" behindDoc="0" locked="0" layoutInCell="1" allowOverlap="1" wp14:anchorId="5DE1B824" wp14:editId="41BE1846">
                   <wp:simplePos x="0" y="0"/>
                   <wp:positionH relativeFrom="column">
-                    <wp:posOffset>4972685</wp:posOffset>
+                    <wp:posOffset>280670</wp:posOffset>
                   </wp:positionH>
                   <wp:positionV relativeFrom="paragraph">
-                    <wp:posOffset>8418195</wp:posOffset>
+                    <wp:posOffset>143510</wp:posOffset>
                   </wp:positionV>
-                  <wp:extent cx="1222375" cy="1806575"/>
-                  <wp:effectExtent l="0" t="0" r="0" b="0"/>
+                  <wp:extent cx="2524125" cy="933450"/>
+                  <wp:effectExtent l="0" t="0" r="9525" b="0"/>
                   <wp:wrapNone/>
-                  <wp:docPr id="2" name="Picture 2"/>
+                  <wp:docPr id="1841798501" name="Picture 18"/>
                   <wp:cNvGraphicFramePr>
                     <a:graphicFrameLocks xmlns:a="http://schemas.openxmlformats.org/drawingml/2006/main" noChangeAspect="1"/>
                   </wp:cNvGraphicFramePr>
@@ -3212,24 +3166,14 @@
                     <a:graphicData uri="http://schemas.openxmlformats.org/drawingml/2006/picture">
                       <pic:pic xmlns:pic="http://schemas.openxmlformats.org/drawingml/2006/picture">
                         <pic:nvPicPr>
-                          <pic:cNvPr id="0" name="Picture 3"/>
+                          <pic:cNvPr id="0" name="Picture 1"/>
                           <pic:cNvPicPr>
                             <a:picLocks noChangeAspect="1" noChangeArrowheads="1"/>
                           </pic:cNvPicPr>
                         </pic:nvPicPr>
                         <pic:blipFill>
-                          <a:blip r:embed="rId9" cstate="print">
-                            <a:clrChange>
-                              <a:clrFrom>
-                                <a:srgbClr val="FFFFFF"/>
-                              </a:clrFrom>
-                              <a:clrTo>
-                                <a:srgbClr val="FFFFFF">
-                                  <a:alpha val="0"/>
-                                </a:srgbClr>
-                              </a:clrTo>
-                            </a:clrChange>
-                            <a:lum contrast="60000"/>
+                          <a:blip r:embed="rId11">
+                            <a:lum bright="10000" contrast="40000"/>
                             <a:extLst>
                               <a:ext uri="{28A0092B-C50C-407E-A947-70E740481C1C}">
                                 <a14:useLocalDpi xmlns:a14="http://schemas.microsoft.com/office/drawing/2010/main" val="0"/>
@@ -3244,15 +3188,12 @@
                         <pic:spPr bwMode="auto">
                           <a:xfrm>
                             <a:off x="0" y="0"/>
-                            <a:ext cx="1222375" cy="1806575"/>
+                            <a:ext cx="2524125" cy="933450"/>
                           </a:xfrm>
                           <a:prstGeom prst="rect">
                             <a:avLst/>
                           </a:prstGeom>
                           <a:noFill/>
-                          <a:ln>
-                            <a:noFill/>
-                          </a:ln>
                         </pic:spPr>
                       </pic:pic>
                     </a:graphicData>
@@ -3266,6 +3207,477 @@
                 </wp:anchor>
               </w:drawing>
             </w:r>
+            <w:proofErr w:type="spellStart"/>
+            <w:r>
+              <w:rPr>
+                <w:rFonts w:ascii="Arial" w:hAnsi="Arial" w:cs="Arial"/>
+                <w:sz w:val="22"/>
+                <w:szCs w:val="22"/>
+                <w:lang w:val="en-AU"/>
+              </w:rPr>
+              <w:t>Asisten</w:t>
+            </w:r>
+            <w:proofErr w:type="spellEnd"/>
+            <w:r>
+              <w:rPr>
+                <w:rFonts w:ascii="Arial" w:hAnsi="Arial" w:cs="Arial"/>
+                <w:sz w:val="22"/>
+                <w:szCs w:val="22"/>
+                <w:lang w:val="en-AU"/>
+              </w:rPr>
+              <w:t xml:space="preserve"> </w:t>
+            </w:r>
+            <w:proofErr w:type="spellStart"/>
+            <w:r>
+              <w:rPr>
+                <w:rFonts w:ascii="Arial" w:hAnsi="Arial" w:cs="Arial"/>
+                <w:sz w:val="22"/>
+                <w:szCs w:val="22"/>
+                <w:lang w:val="en-AU"/>
+              </w:rPr>
+              <w:t>Administrasi</w:t>
+            </w:r>
+            <w:proofErr w:type="spellEnd"/>
+            <w:r>
+              <w:rPr>
+                <w:rFonts w:ascii="Arial" w:hAnsi="Arial" w:cs="Arial"/>
+                <w:sz w:val="22"/>
+                <w:szCs w:val="22"/>
+                <w:lang w:val="en-AU"/>
+              </w:rPr>
+              <w:t xml:space="preserve"> Umum</w:t>
+            </w:r>
+          </w:p>
+          <w:p>
+            <w:pPr>
+              <w:jc w:val="center"/>
+              <w:rPr>
+                <w:rFonts w:ascii="Arial" w:hAnsi="Arial" w:cs="Arial"/>
+                <w:sz w:val="22"/>
+                <w:szCs w:val="22"/>
+              </w:rPr>
+            </w:pPr>
+            <w:proofErr w:type="spellStart"/>
+            <w:r>
+              <w:rPr>
+                <w:rFonts w:ascii="Arial" w:hAnsi="Arial" w:cs="Arial"/>
+                <w:sz w:val="22"/>
+                <w:szCs w:val="22"/>
+                <w:lang w:val="en-AU"/>
+              </w:rPr>
+              <w:t>Sekretariat</w:t>
+            </w:r>
+            <w:proofErr w:type="spellEnd"/>
+            <w:r>
+              <w:rPr>
+                <w:rFonts w:ascii="Arial" w:hAnsi="Arial" w:cs="Arial"/>
+                <w:sz w:val="22"/>
+                <w:szCs w:val="22"/>
+                <w:lang w:val="en-AU"/>
+              </w:rPr>
+              <w:t xml:space="preserve"> Daerah </w:t>
+            </w:r>
+            <w:proofErr w:type="spellStart"/>
+            <w:r>
+              <w:rPr>
+                <w:rFonts w:ascii="Arial" w:hAnsi="Arial" w:cs="Arial"/>
+                <w:sz w:val="22"/>
+                <w:szCs w:val="22"/>
+                <w:lang w:val="en-AU"/>
+              </w:rPr>
+              <w:t>Provinsi</w:t>
+            </w:r>
+            <w:proofErr w:type="spellEnd"/>
+            <w:r>
+              <w:rPr>
+                <w:rFonts w:ascii="Arial" w:hAnsi="Arial" w:cs="Arial"/>
+                <w:sz w:val="22"/>
+                <w:szCs w:val="22"/>
+                <w:lang w:val="en-AU"/>
+              </w:rPr>
+              <w:t xml:space="preserve"> Jawa Timur</w:t>
+            </w:r>
+          </w:p>
+          <w:p>
+            <w:pPr>
+              <w:jc w:val="center"/>
+              <w:rPr>
+                <w:rFonts w:ascii="Arial" w:hAnsi="Arial" w:cs="Arial"/>
+                <w:sz w:val="22"/>
+                <w:szCs w:val="22"/>
+              </w:rPr>
+            </w:pPr>
+          </w:p>
+          <w:p>
+            <w:pPr>
+              <w:jc w:val="center"/>
+              <w:rPr>
+                <w:rFonts w:ascii="Arial" w:hAnsi="Arial" w:cs="Arial"/>
+                <w:sz w:val="22"/>
+                <w:szCs w:val="22"/>
+              </w:rPr>
+            </w:pPr>
+          </w:p>
+          <w:p>
+            <w:pPr>
+              <w:jc w:val="center"/>
+              <w:rPr>
+                <w:rFonts w:ascii="Arial" w:hAnsi="Arial" w:cs="Arial"/>
+                <w:sz w:val="22"/>
+                <w:szCs w:val="22"/>
+              </w:rPr>
+            </w:pPr>
+          </w:p>
+          <w:p>
+            <w:pPr>
+              <w:jc w:val="center"/>
+              <w:rPr>
+                <w:rFonts w:ascii="Arial" w:hAnsi="Arial" w:cs="Arial"/>
+                <w:sz w:val="22"/>
+                <w:szCs w:val="22"/>
+              </w:rPr>
+            </w:pPr>
+          </w:p>
+          <w:p>
+            <w:pPr>
+              <w:jc w:val="center"/>
+              <w:rPr>
+                <w:rFonts w:ascii="Arial" w:hAnsi="Arial" w:cs="Arial"/>
+                <w:sz w:val="22"/>
+                <w:szCs w:val="22"/>
+                <w:u w:val="single"/>
+              </w:rPr>
+            </w:pPr>
+            <w:r>
+              <w:rPr>
+                <w:rFonts w:ascii="Arial" w:hAnsi="Arial" w:cs="Arial"/>
+                <w:sz w:val="22"/>
+                <w:szCs w:val="22"/>
+                <w:u w:val="single"/>
+              </w:rPr>
+              <w:t xml:space="preserve">R. HERU WAHONO SANTOSO </w:t>
+            </w:r>
+            <w:proofErr w:type="spellStart"/>
+            <w:proofErr w:type="gramStart"/>
+            <w:r>
+              <w:rPr>
+                <w:rFonts w:ascii="Arial" w:hAnsi="Arial" w:cs="Arial"/>
+                <w:sz w:val="22"/>
+                <w:szCs w:val="22"/>
+                <w:u w:val="single"/>
+              </w:rPr>
+              <w:t>S.Sos</w:t>
+            </w:r>
+            <w:proofErr w:type="spellEnd"/>
+            <w:proofErr w:type="gramEnd"/>
+            <w:r>
+              <w:rPr>
+                <w:rFonts w:ascii="Arial" w:hAnsi="Arial" w:cs="Arial"/>
+                <w:sz w:val="22"/>
+                <w:szCs w:val="22"/>
+                <w:u w:val="single"/>
+              </w:rPr>
+              <w:t>, MM</w:t>
+            </w:r>
+          </w:p>
+          <w:p>
+            <w:pPr>
+              <w:jc w:val="center"/>
+              <w:rPr>
+                <w:rFonts w:ascii="Arial" w:hAnsi="Arial" w:cs="Arial"/>
+                <w:sz w:val="22"/>
+                <w:szCs w:val="22"/>
+              </w:rPr>
+            </w:pPr>
+            <w:r>
+              <w:rPr>
+                <w:rFonts w:ascii="Arial" w:hAnsi="Arial" w:cs="Arial"/>
+                <w:sz w:val="22"/>
+                <w:szCs w:val="22"/>
+              </w:rPr>
+              <w:t xml:space="preserve">NIP. </w:t>
+            </w:r>
+            <w:r>
+              <w:rPr>
+                <w:rFonts w:ascii="Arial" w:hAnsi="Arial" w:cs="Arial"/>
+                <w:sz w:val="22"/>
+                <w:szCs w:val="22"/>
+                <w:shd w:val="clear" w:color="auto" w:fill="FFFFFF"/>
+              </w:rPr>
+              <w:t>19670221 198809 1 001</w:t>
+            </w:r>
+          </w:p>
+        </w:tc>
+        <w:tc>
+          <w:tcPr>
+            <w:tcW w:w="5263" w:type="dxa"/>
+          </w:tcPr>
+          <w:p>
+            <w:pPr>
+              <w:jc w:val="center"/>
+              <w:rPr>
+                <w:rFonts w:ascii="Arial" w:hAnsi="Arial" w:cs="Arial"/>
+                <w:sz w:val="22"/>
+                <w:szCs w:val="22"/>
+                <w:lang w:val="id-ID"/>
+              </w:rPr>
+            </w:pPr>
+            <w:r>
+              <w:rPr>
+                <w:rFonts w:ascii="Arial" w:hAnsi="Arial" w:cs="Arial"/>
+                <w:sz w:val="22"/>
+                <w:szCs w:val="22"/>
+                <w:lang w:val="id-ID"/>
+              </w:rPr>
+              <w:t>Pejabat</w:t>
+            </w:r>
+          </w:p>
+          <w:p>
+            <w:pPr>
+              <w:jc w:val="center"/>
+              <w:rPr>
+                <w:rFonts w:ascii="Arial" w:hAnsi="Arial" w:cs="Arial"/>
+              </w:rPr>
+            </w:pPr>
+            <w:r>
+              <w:rPr>
+                <w:rFonts w:ascii="Arial" w:hAnsi="Arial" w:cs="Arial"/>
+                <w:sz w:val="22"/>
+                <w:szCs w:val="22"/>
+                <w:lang w:val="id-ID"/>
+              </w:rPr>
+              <w:t>Yang mengambil sumpah</w:t>
+            </w:r>
+            <w:r>
+              <w:rPr>
+                <w:rFonts w:ascii="Arial" w:hAnsi="Arial" w:cs="Arial"/>
+                <w:sz w:val="22"/>
+                <w:szCs w:val="22"/>
+                <w:lang w:val="en-AU"/>
+              </w:rPr>
+              <w:t>,</w:t>
+            </w:r>
+          </w:p>
+          <w:p>
+            <w:pPr>
+              <w:jc w:val="center"/>
+              <w:rPr>
+                <w:rFonts w:ascii="Arial" w:hAnsi="Arial" w:cs="Arial"/>
+                <w:sz w:val="22"/>
+                <w:szCs w:val="22"/>
+                <w:lang w:val="en-AU"/>
+              </w:rPr>
+            </w:pPr>
+            <w:proofErr w:type="spellStart"/>
+            <w:r>
+              <w:rPr>
+                <w:rFonts w:ascii="Arial" w:hAnsi="Arial" w:cs="Arial"/>
+                <w:sz w:val="22"/>
+                <w:szCs w:val="22"/>
+                <w:lang w:val="en-AU"/>
+              </w:rPr>
+              <w:t>Asisten</w:t>
+            </w:r>
+            <w:proofErr w:type="spellEnd"/>
+            <w:r>
+              <w:rPr>
+                <w:rFonts w:ascii="Arial" w:hAnsi="Arial" w:cs="Arial"/>
+                <w:sz w:val="22"/>
+                <w:szCs w:val="22"/>
+                <w:lang w:val="en-AU"/>
+              </w:rPr>
+              <w:t xml:space="preserve"> </w:t>
+            </w:r>
+            <w:proofErr w:type="spellStart"/>
+            <w:r>
+              <w:rPr>
+                <w:rFonts w:ascii="Arial" w:hAnsi="Arial" w:cs="Arial"/>
+                <w:sz w:val="22"/>
+                <w:szCs w:val="22"/>
+                <w:lang w:val="en-AU"/>
+              </w:rPr>
+              <w:t>Administrasi</w:t>
+            </w:r>
+            <w:proofErr w:type="spellEnd"/>
+            <w:r>
+              <w:rPr>
+                <w:rFonts w:ascii="Arial" w:hAnsi="Arial" w:cs="Arial"/>
+                <w:sz w:val="22"/>
+                <w:szCs w:val="22"/>
+                <w:lang w:val="en-AU"/>
+              </w:rPr>
+              <w:t xml:space="preserve"> Umum</w:t>
+            </w:r>
+          </w:p>
+          <w:p>
+            <w:pPr>
+              <w:jc w:val="center"/>
+              <w:rPr>
+                <w:rFonts w:ascii="Arial" w:hAnsi="Arial" w:cs="Arial"/>
+                <w:sz w:val="22"/>
+                <w:szCs w:val="22"/>
+              </w:rPr>
+            </w:pPr>
+          </w:p>
+          <w:p>
+            <w:pPr>
+              <w:jc w:val="center"/>
+              <w:rPr>
+                <w:rFonts w:ascii="Arial" w:hAnsi="Arial" w:cs="Arial"/>
+                <w:sz w:val="22"/>
+                <w:szCs w:val="22"/>
+              </w:rPr>
+            </w:pPr>
+          </w:p>
+          <w:p>
+            <w:pPr>
+              <w:jc w:val="center"/>
+              <w:rPr>
+                <w:rFonts w:ascii="Arial" w:hAnsi="Arial" w:cs="Arial"/>
+                <w:sz w:val="22"/>
+                <w:szCs w:val="22"/>
+              </w:rPr>
+            </w:pPr>
+          </w:p>
+          <w:p>
+            <w:pPr>
+              <w:jc w:val="center"/>
+              <w:rPr>
+                <w:rFonts w:ascii="Arial" w:hAnsi="Arial" w:cs="Arial"/>
+                <w:sz w:val="22"/>
+                <w:szCs w:val="22"/>
+                <w:u w:val="single"/>
+              </w:rPr>
+            </w:pPr>
+            <w:r>
+              <w:rPr>
+                <w:rFonts w:ascii="Arial" w:hAnsi="Arial" w:cs="Arial"/>
+                <w:sz w:val="22"/>
+                <w:szCs w:val="22"/>
+                <w:u w:val="single"/>
+              </w:rPr>
+              <w:t>Drs. SJAICHUL GHULAM, M.M</w:t>
+            </w:r>
+          </w:p>
+          <w:p>
+            <w:pPr>
+              <w:jc w:val="center"/>
+              <w:rPr>
+                <w:rFonts w:ascii="Arial" w:hAnsi="Arial" w:cs="Arial"/>
+                <w:sz w:val="22"/>
+                <w:szCs w:val="22"/>
+              </w:rPr>
+            </w:pPr>
+            <w:r>
+              <w:rPr>
+                <w:rFonts w:ascii="Arial" w:hAnsi="Arial" w:cs="Arial"/>
+                <w:sz w:val="22"/>
+                <w:szCs w:val="22"/>
+              </w:rPr>
+              <w:t>19620803 198702 1 004</w:t>
+            </w:r>
+          </w:p>
+        </w:tc>
+        <w:tc>
+          <w:tcPr>
+            <w:tcW w:w="5267" w:type="dxa"/>
+            <w:tcMar>
+              <w:left w:w="0" w:type="dxa"/>
+              <w:right w:w="0" w:type="dxa"/>
+            </w:tcMar>
+          </w:tcPr>
+          <w:p>
+            <w:pPr>
+              <w:snapToGrid w:val="0"/>
+              <w:rPr>
+                <w:rFonts w:ascii="Arial" w:hAnsi="Arial" w:cs="Arial"/>
+                <w:sz w:val="22"/>
+                <w:szCs w:val="22"/>
+              </w:rPr>
+            </w:pPr>
+          </w:p>
+        </w:tc>
+      </w:tr>
+      <w:tr>
+        <w:tc>
+          <w:tcPr>
+            <w:tcW w:w="10903" w:type="dxa"/>
+            <w:gridSpan w:val="2"/>
+          </w:tcPr>
+          <w:p>
+            <w:pPr>
+              <w:tabs>
+                <w:tab w:val="center" w:pos="5157"/>
+                <w:tab w:val="left" w:pos="8265"/>
+              </w:tabs>
+              <w:rPr>
+                <w:rFonts w:ascii="Arial" w:hAnsi="Arial" w:cs="Arial"/>
+              </w:rPr>
+            </w:pPr>
+            <w:r>
+              <w:rPr>
+                <w:noProof/>
+              </w:rPr>
+              <w:drawing>
+                <wp:anchor distT="0" distB="0" distL="114300" distR="114300" simplePos="0" relativeHeight="251667456" behindDoc="0" locked="0" layoutInCell="1" allowOverlap="1" wp14:anchorId="376214D2" wp14:editId="60003A6C">
+                  <wp:simplePos x="0" y="0"/>
+                  <wp:positionH relativeFrom="column">
+                    <wp:posOffset>4326255</wp:posOffset>
+                  </wp:positionH>
+                  <wp:positionV relativeFrom="paragraph">
+                    <wp:posOffset>29845</wp:posOffset>
+                  </wp:positionV>
+                  <wp:extent cx="1597025" cy="1156970"/>
+                  <wp:effectExtent l="0" t="0" r="3175" b="5080"/>
+                  <wp:wrapNone/>
+                  <wp:docPr id="626063664" name="Picture 17"/>
+                  <wp:cNvGraphicFramePr>
+                    <a:graphicFrameLocks xmlns:a="http://schemas.openxmlformats.org/drawingml/2006/main" noChangeAspect="1"/>
+                  </wp:cNvGraphicFramePr>
+                  <a:graphic xmlns:a="http://schemas.openxmlformats.org/drawingml/2006/main">
+                    <a:graphicData uri="http://schemas.openxmlformats.org/drawingml/2006/picture">
+                      <pic:pic xmlns:pic="http://schemas.openxmlformats.org/drawingml/2006/picture">
+                        <pic:nvPicPr>
+                          <pic:cNvPr id="0" name="Picture 19"/>
+                          <pic:cNvPicPr>
+                            <a:picLocks noChangeAspect="1" noChangeArrowheads="1"/>
+                          </pic:cNvPicPr>
+                        </pic:nvPicPr>
+                        <pic:blipFill>
+                          <a:blip r:embed="rId12" cstate="print">
+                            <a:extLst>
+                              <a:ext uri="{28A0092B-C50C-407E-A947-70E740481C1C}">
+                                <a14:useLocalDpi xmlns:a14="http://schemas.microsoft.com/office/drawing/2010/main" val="0"/>
+                              </a:ext>
+                            </a:extLst>
+                          </a:blip>
+                          <a:srcRect/>
+                          <a:stretch>
+                            <a:fillRect/>
+                          </a:stretch>
+                        </pic:blipFill>
+                        <pic:spPr bwMode="auto">
+                          <a:xfrm>
+                            <a:off x="0" y="0"/>
+                            <a:ext cx="1597025" cy="1156970"/>
+                          </a:xfrm>
+                          <a:prstGeom prst="rect">
+                            <a:avLst/>
+                          </a:prstGeom>
+                          <a:noFill/>
+                        </pic:spPr>
+                      </pic:pic>
+                    </a:graphicData>
+                  </a:graphic>
+                  <wp14:sizeRelH relativeFrom="page">
+                    <wp14:pctWidth>0</wp14:pctWidth>
+                  </wp14:sizeRelH>
+                  <wp14:sizeRelV relativeFrom="page">
+                    <wp14:pctHeight>0</wp14:pctHeight>
+                  </wp14:sizeRelV>
+                </wp:anchor>
+              </w:drawing>
+            </w:r>
             <w:r>
               <w:rPr>
                 <w:rFonts w:ascii="Arial" w:hAnsi="Arial" w:cs="Arial"/>
@@ -3273,7 +3685,25 @@
                 <w:szCs w:val="22"/>
               </w:rPr>
               <w:tab/>
-              <w:t>Saksi – Saksi :</w:t>
+              <w:t xml:space="preserve">       Saksi – </w:t>
+            </w:r>
+            <w:proofErr w:type="gramStart"/>
+            <w:r>
+              <w:rPr>
+                <w:rFonts w:ascii="Arial" w:hAnsi="Arial" w:cs="Arial"/>
+                <w:sz w:val="22"/>
+                <w:szCs w:val="22"/>
+              </w:rPr>
+              <w:t>Saksi :</w:t>
+            </w:r>
+            <w:proofErr w:type="gramEnd"/>
+            <w:r>
+              <w:rPr>
+                <w:rFonts w:ascii="Arial" w:hAnsi="Arial" w:cs="Arial"/>
+                <w:sz w:val="22"/>
+                <w:szCs w:val="22"/>
+              </w:rPr>
+              <w:tab/>
             </w:r>
           </w:p>
         </w:tc>
@@ -3301,8 +3731,18 @@
                 <w:szCs w:val="22"/>
               </w:rPr>
               <w:tab/>
-              <w:t>Saksi – Saksi :</w:t>
-            </w:r>
+              <w:t xml:space="preserve">Saksi – </w:t>
+            </w:r>
+            <w:proofErr w:type="gramStart"/>
+            <w:r>
+              <w:rPr>
+                <w:rFonts w:ascii="Arial" w:hAnsi="Arial" w:cs="Arial"/>
+                <w:sz w:val="22"/>
+                <w:szCs w:val="22"/>
+              </w:rPr>
+              <w:t>Saksi :</w:t>
+            </w:r>
+            <w:proofErr w:type="gramEnd"/>
             <w:r>
               <w:rPr>
                 <w:rFonts w:ascii="Arial" w:hAnsi="Arial" w:cs="Arial"/>
@@ -3316,63 +3756,50 @@
       </w:tr>
       <w:tr>
         <w:trPr>
-          <w:gridAfter w:val="1"/>
-          <w:wAfter w:w="5265" w:type="dxa"/>
           <w:trHeight w:val="1624"/>
         </w:trPr>
         <w:tc>
           <w:tcPr>
-            <w:tcW w:w="5265" w:type="dxa"/>
+            <w:tcW w:w="5636" w:type="dxa"/>
           </w:tcPr>
           <w:p>
             <w:pPr>
-              <w:ind w:firstLine="993"/>
-              <w:rPr>
-                <w:rFonts w:ascii="Arial" w:hAnsi="Arial" w:cs="Arial"/>
-                <w:noProof/>
-                <w:sz w:val="10"/>
-                <w:szCs w:val="10"/>
+              <w:snapToGrid w:val="0"/>
+              <w:ind w:firstLine="1418"/>
+              <w:rPr>
+                <w:rFonts w:ascii="Arial" w:hAnsi="Arial" w:cs="Arial"/>
+                <w:sz w:val="22"/>
+                <w:szCs w:val="22"/>
               </w:rPr>
             </w:pPr>
           </w:p>
           <w:p>
             <w:pPr>
-              <w:ind w:left="567" w:firstLine="993"/>
-              <w:rPr>
-                <w:rFonts w:ascii="Arial" w:hAnsi="Arial" w:cs="Arial"/>
-                <w:noProof/>
+              <w:ind w:firstLine="1418"/>
+              <w:rPr>
+                <w:rFonts w:ascii="Arial" w:hAnsi="Arial" w:cs="Arial"/>
+                <w:sz w:val="22"/>
+                <w:szCs w:val="22"/>
               </w:rPr>
             </w:pPr>
           </w:p>
           <w:p>
             <w:pPr>
-              <w:ind w:left="567" w:firstLine="993"/>
-              <w:rPr>
-                <w:rFonts w:ascii="Arial" w:hAnsi="Arial" w:cs="Arial"/>
-                <w:noProof/>
+              <w:ind w:firstLine="1418"/>
+              <w:rPr>
+                <w:rFonts w:ascii="Arial" w:hAnsi="Arial" w:cs="Arial"/>
+                <w:sz w:val="22"/>
+                <w:szCs w:val="22"/>
               </w:rPr>
             </w:pPr>
           </w:p>
           <w:p>
             <w:pPr>
-              <w:ind w:left="567" w:firstLine="993"/>
-              <w:rPr>
-                <w:rFonts w:ascii="Arial" w:hAnsi="Arial" w:cs="Arial"/>
-                <w:noProof/>
-                <w:sz w:val="14"/>
-                <w:szCs w:val="14"/>
-              </w:rPr>
-            </w:pPr>
-          </w:p>
-          <w:p>
-            <w:pPr>
-              <w:ind w:left="567" w:firstLine="993"/>
-              <w:rPr>
-                <w:rFonts w:ascii="Arial" w:hAnsi="Arial" w:cs="Arial"/>
-                <w:noProof/>
-                <w:sz w:val="22"/>
-                <w:szCs w:val="22"/>
-                <w:u w:val="single"/>
+              <w:ind w:firstLine="1418"/>
+              <w:rPr>
+                <w:rFonts w:ascii="Arial" w:hAnsi="Arial" w:cs="Arial"/>
+                <w:sz w:val="22"/>
+                <w:szCs w:val="22"/>
               </w:rPr>
             </w:pPr>
           </w:p>
@@ -3389,14 +3816,27 @@
             <w:r>
               <w:rPr>
                 <w:rFonts w:ascii="Arial" w:hAnsi="Arial" w:cs="Arial"/>
-                <w:noProof/>
                 <w:sz w:val="22"/>
                 <w:szCs w:val="22"/>
                 <w:u w:val="single"/>
                 <w:shd w:val="clear" w:color="auto" w:fill="FFFFFF"/>
               </w:rPr>
-              <w:t>INDAH WAHYUNI, SH, M.Si</w:t>
-            </w:r>
+              <w:t xml:space="preserve">INDAH WAHYUNI, SH, </w:t>
+            </w:r>
+            <w:proofErr w:type="spellStart"/>
+            <w:proofErr w:type="gramStart"/>
+            <w:r>
+              <w:rPr>
+                <w:rFonts w:ascii="Arial" w:hAnsi="Arial" w:cs="Arial"/>
+                <w:sz w:val="22"/>
+                <w:szCs w:val="22"/>
+                <w:u w:val="single"/>
+                <w:shd w:val="clear" w:color="auto" w:fill="FFFFFF"/>
+              </w:rPr>
+              <w:t>M.Si</w:t>
+            </w:r>
+            <w:proofErr w:type="spellEnd"/>
+            <w:proofErr w:type="gramEnd"/>
             <w:r>
               <w:rPr>
                 <w:rFonts w:ascii="Arial" w:hAnsi="Arial" w:cs="Arial"/>
@@ -3446,7 +3886,6 @@
             <w:r>
               <w:rPr>
                 <w:rFonts w:ascii="Arial" w:hAnsi="Arial" w:cs="Arial"/>
-                <w:noProof/>
                 <w:sz w:val="22"/>
                 <w:szCs w:val="22"/>
                 <w:shd w:val="clear" w:color="auto" w:fill="FFFFFF"/>
@@ -3457,14 +3896,16 @@
         </w:tc>
         <w:tc>
           <w:tcPr>
-            <w:tcW w:w="5367" w:type="dxa"/>
+            <w:tcW w:w="5267" w:type="dxa"/>
           </w:tcPr>
           <w:p>
             <w:pPr>
+              <w:snapToGrid w:val="0"/>
               <w:jc w:val="center"/>
               <w:rPr>
                 <w:rFonts w:ascii="Arial" w:hAnsi="Arial" w:cs="Arial"/>
-                <w:noProof/>
+                <w:sz w:val="22"/>
+                <w:szCs w:val="22"/>
               </w:rPr>
             </w:pPr>
           </w:p>
@@ -3473,9 +3914,8 @@
               <w:jc w:val="center"/>
               <w:rPr>
                 <w:rFonts w:ascii="Arial" w:hAnsi="Arial" w:cs="Arial"/>
-                <w:noProof/>
-                <w:sz w:val="14"/>
-                <w:szCs w:val="14"/>
+                <w:sz w:val="22"/>
+                <w:szCs w:val="22"/>
               </w:rPr>
             </w:pPr>
           </w:p>
@@ -3484,9 +3924,8 @@
               <w:jc w:val="center"/>
               <w:rPr>
                 <w:rFonts w:ascii="Arial" w:hAnsi="Arial" w:cs="Arial"/>
-                <w:noProof/>
-                <w:sz w:val="10"/>
-                <w:szCs w:val="10"/>
+                <w:sz w:val="22"/>
+                <w:szCs w:val="22"/>
               </w:rPr>
             </w:pPr>
           </w:p>
@@ -3495,7 +3934,8 @@
               <w:jc w:val="center"/>
               <w:rPr>
                 <w:rFonts w:ascii="Arial" w:hAnsi="Arial" w:cs="Arial"/>
-                <w:noProof/>
+                <w:sz w:val="22"/>
+                <w:szCs w:val="22"/>
               </w:rPr>
             </w:pPr>
           </w:p>
@@ -3504,7 +3944,111 @@
               <w:jc w:val="center"/>
               <w:rPr>
                 <w:rFonts w:ascii="Arial" w:hAnsi="Arial" w:cs="Arial"/>
-                <w:noProof/>
+                <w:sz w:val="22"/>
+                <w:szCs w:val="22"/>
+                <w:u w:val="single"/>
+                <w:shd w:val="clear" w:color="auto" w:fill="FFFFFF"/>
+              </w:rPr>
+            </w:pPr>
+            <w:r>
+              <w:rPr>
+                <w:rFonts w:ascii="Arial" w:hAnsi="Arial" w:cs="Arial"/>
+                <w:sz w:val="22"/>
+                <w:szCs w:val="22"/>
+                <w:u w:val="single"/>
+              </w:rPr>
+              <w:t xml:space="preserve">ADINA FIBRIANI </w:t>
+            </w:r>
+            <w:proofErr w:type="spellStart"/>
+            <w:proofErr w:type="gramStart"/>
+            <w:r>
+              <w:rPr>
+                <w:rFonts w:ascii="Arial" w:hAnsi="Arial" w:cs="Arial"/>
+                <w:sz w:val="22"/>
+                <w:szCs w:val="22"/>
+                <w:u w:val="single"/>
+              </w:rPr>
+              <w:t>S.E</w:t>
+            </w:r>
+            <w:proofErr w:type="gramEnd"/>
+            <w:r>
+              <w:rPr>
+                <w:rFonts w:ascii="Arial" w:hAnsi="Arial" w:cs="Arial"/>
+                <w:sz w:val="22"/>
+                <w:szCs w:val="22"/>
+                <w:u w:val="single"/>
+              </w:rPr>
+              <w:t>,</w:t>
+            </w:r>
+            <w:proofErr w:type="gramStart"/>
+            <w:r>
+              <w:rPr>
+                <w:rFonts w:ascii="Arial" w:hAnsi="Arial" w:cs="Arial"/>
+                <w:sz w:val="22"/>
+                <w:szCs w:val="22"/>
+                <w:u w:val="single"/>
+              </w:rPr>
+              <w:t>M.Ak</w:t>
+            </w:r>
+            <w:proofErr w:type="spellEnd"/>
+            <w:proofErr w:type="gramEnd"/>
+          </w:p>
+          <w:p>
+            <w:pPr>
+              <w:jc w:val="center"/>
+              <w:rPr>
+                <w:rFonts w:ascii="Arial" w:hAnsi="Arial" w:cs="Arial"/>
+                <w:sz w:val="22"/>
+                <w:szCs w:val="22"/>
+              </w:rPr>
+            </w:pPr>
+            <w:r>
+              <w:rPr>
+                <w:rFonts w:ascii="Arial" w:hAnsi="Arial" w:cs="Arial"/>
+                <w:sz w:val="22"/>
+                <w:szCs w:val="22"/>
+                <w:lang w:val="id-ID"/>
+              </w:rPr>
+              <w:t>N</w:t>
+            </w:r>
+            <w:r>
+              <w:rPr>
+                <w:rFonts w:ascii="Arial" w:hAnsi="Arial" w:cs="Arial"/>
+                <w:sz w:val="22"/>
+                <w:szCs w:val="22"/>
+              </w:rPr>
+              <w:t>IP</w:t>
+            </w:r>
+            <w:r>
+              <w:rPr>
+                <w:rFonts w:ascii="Arial" w:hAnsi="Arial" w:cs="Arial"/>
+                <w:sz w:val="22"/>
+                <w:szCs w:val="22"/>
+                <w:lang w:val="id-ID"/>
+              </w:rPr>
+              <w:t xml:space="preserve">. </w:t>
+            </w:r>
+            <w:r>
+              <w:rPr>
+                <w:rFonts w:ascii="Arial" w:hAnsi="Arial" w:cs="Arial"/>
+                <w:sz w:val="22"/>
+                <w:szCs w:val="22"/>
+                <w:shd w:val="clear" w:color="auto" w:fill="FFFFFF"/>
+              </w:rPr>
+              <w:t>19720211 199903 2 005</w:t>
+            </w:r>
+          </w:p>
+        </w:tc>
+        <w:tc>
+          <w:tcPr>
+            <w:tcW w:w="5263" w:type="dxa"/>
+          </w:tcPr>
+          <w:p>
+            <w:pPr>
+              <w:snapToGrid w:val="0"/>
+              <w:jc w:val="center"/>
+              <w:rPr>
+                <w:rFonts w:ascii="Arial" w:hAnsi="Arial" w:cs="Arial"/>
                 <w:sz w:val="22"/>
                 <w:szCs w:val="22"/>
               </w:rPr>
@@ -3515,80 +4059,6 @@
               <w:jc w:val="center"/>
               <w:rPr>
                 <w:rFonts w:ascii="Arial" w:hAnsi="Arial" w:cs="Arial"/>
-                <w:noProof/>
-                <w:sz w:val="22"/>
-                <w:szCs w:val="22"/>
-                <w:u w:val="single"/>
-                <w:shd w:val="clear" w:color="auto" w:fill="FFFFFF"/>
-              </w:rPr>
-            </w:pPr>
-            <w:r>
-              <w:rPr>
-                <w:rFonts w:ascii="Arial" w:hAnsi="Arial" w:cs="Arial"/>
-                <w:sz w:val="22"/>
-                <w:szCs w:val="22"/>
-                <w:u w:val="single"/>
-              </w:rPr>
-              <w:t>ADINA FIBRIANI S.E,M.Ak</w:t>
-            </w:r>
-          </w:p>
-          <w:p>
-            <w:pPr>
-              <w:jc w:val="center"/>
-              <w:rPr>
-                <w:rFonts w:ascii="Arial" w:hAnsi="Arial" w:cs="Arial"/>
-                <w:noProof/>
-                <w:sz w:val="22"/>
-                <w:szCs w:val="22"/>
-              </w:rPr>
-            </w:pPr>
-            <w:r>
-              <w:rPr>
-                <w:rFonts w:ascii="Arial" w:hAnsi="Arial" w:cs="Arial"/>
-                <w:sz w:val="22"/>
-                <w:szCs w:val="22"/>
-                <w:lang w:val="id-ID"/>
-              </w:rPr>
-              <w:t>N</w:t>
-            </w:r>
-            <w:r>
-              <w:rPr>
-                <w:rFonts w:ascii="Arial" w:hAnsi="Arial" w:cs="Arial"/>
-                <w:sz w:val="22"/>
-                <w:szCs w:val="22"/>
-              </w:rPr>
-              <w:t>IP</w:t>
-            </w:r>
-            <w:r>
-              <w:rPr>
-                <w:rFonts w:ascii="Arial" w:hAnsi="Arial" w:cs="Arial"/>
-                <w:sz w:val="22"/>
-                <w:szCs w:val="22"/>
-                <w:lang w:val="id-ID"/>
-              </w:rPr>
-              <w:t xml:space="preserve">. </w:t>
-            </w:r>
-            <w:r>
-              <w:rPr>
-                <w:rFonts w:ascii="Arial" w:hAnsi="Arial" w:cs="Arial"/>
-                <w:sz w:val="22"/>
-                <w:szCs w:val="22"/>
-                <w:shd w:val="clear" w:color="auto" w:fill="FFFFFF"/>
-              </w:rPr>
-              <w:t>19720211 199903 2 005</w:t>
-            </w:r>
-          </w:p>
-        </w:tc>
-        <w:tc>
-          <w:tcPr>
-            <w:tcW w:w="5265" w:type="dxa"/>
-          </w:tcPr>
-          <w:p>
-            <w:pPr>
-              <w:jc w:val="center"/>
-              <w:rPr>
-                <w:rFonts w:ascii="Arial" w:hAnsi="Arial" w:cs="Arial"/>
-                <w:noProof/>
                 <w:sz w:val="22"/>
                 <w:szCs w:val="22"/>
               </w:rPr>
@@ -3599,7 +4069,6 @@
               <w:jc w:val="center"/>
               <w:rPr>
                 <w:rFonts w:ascii="Arial" w:hAnsi="Arial" w:cs="Arial"/>
-                <w:noProof/>
                 <w:sz w:val="22"/>
                 <w:szCs w:val="22"/>
               </w:rPr>
@@ -3610,7 +4079,6 @@
               <w:jc w:val="center"/>
               <w:rPr>
                 <w:rFonts w:ascii="Arial" w:hAnsi="Arial" w:cs="Arial"/>
-                <w:noProof/>
                 <w:sz w:val="22"/>
                 <w:szCs w:val="22"/>
               </w:rPr>
@@ -3623,8 +4091,48 @@
                 <w:rFonts w:ascii="Arial" w:hAnsi="Arial" w:cs="Arial"/>
                 <w:sz w:val="22"/>
                 <w:szCs w:val="22"/>
+                <w:u w:val="single"/>
               </w:rPr>
             </w:pPr>
+            <w:r>
+              <w:rPr>
+                <w:rFonts w:ascii="Arial" w:hAnsi="Arial" w:cs="Arial"/>
+                <w:sz w:val="22"/>
+                <w:szCs w:val="22"/>
+                <w:u w:val="single"/>
+              </w:rPr>
+              <w:t xml:space="preserve">Dr. </w:t>
+            </w:r>
+            <w:r>
+              <w:rPr>
+                <w:rFonts w:ascii="Arial" w:hAnsi="Arial" w:cs="Arial"/>
+                <w:sz w:val="22"/>
+                <w:szCs w:val="22"/>
+                <w:u w:val="single"/>
+                <w:lang w:val="id-ID"/>
+              </w:rPr>
+              <w:t>RAMLIYANTO.</w:t>
+            </w:r>
+            <w:r>
+              <w:rPr>
+                <w:rFonts w:ascii="Arial" w:hAnsi="Arial" w:cs="Arial"/>
+                <w:sz w:val="22"/>
+                <w:szCs w:val="22"/>
+                <w:u w:val="single"/>
+              </w:rPr>
+              <w:t xml:space="preserve"> </w:t>
+            </w:r>
+            <w:proofErr w:type="gramStart"/>
+            <w:r>
+              <w:rPr>
+                <w:rFonts w:ascii="Arial" w:hAnsi="Arial" w:cs="Arial"/>
+                <w:sz w:val="22"/>
+                <w:szCs w:val="22"/>
+                <w:u w:val="single"/>
+              </w:rPr>
+              <w:t>S.P.,M.P.</w:t>
+            </w:r>
+            <w:proofErr w:type="gramEnd"/>
           </w:p>
           <w:p>
             <w:pPr>
@@ -3633,99 +4141,78 @@
                 <w:rFonts w:ascii="Arial" w:hAnsi="Arial" w:cs="Arial"/>
                 <w:sz w:val="22"/>
                 <w:szCs w:val="22"/>
-                <w:u w:val="single"/>
               </w:rPr>
             </w:pPr>
             <w:r>
               <w:rPr>
                 <w:rFonts w:ascii="Arial" w:hAnsi="Arial" w:cs="Arial"/>
-                <w:noProof/>
-                <w:sz w:val="22"/>
-                <w:szCs w:val="22"/>
-                <w:u w:val="single"/>
-              </w:rPr>
-              <w:t xml:space="preserve">Dr. </w:t>
-            </w:r>
-            <w:r>
-              <w:rPr>
-                <w:rFonts w:ascii="Arial" w:hAnsi="Arial" w:cs="Arial"/>
-                <w:noProof/>
-                <w:sz w:val="22"/>
-                <w:szCs w:val="22"/>
-                <w:u w:val="single"/>
+                <w:sz w:val="22"/>
+                <w:szCs w:val="22"/>
                 <w:lang w:val="id-ID"/>
               </w:rPr>
-              <w:t>RAMLIYANTO.</w:t>
-            </w:r>
-            <w:r>
-              <w:rPr>
-                <w:rFonts w:ascii="Arial" w:hAnsi="Arial" w:cs="Arial"/>
-                <w:noProof/>
-                <w:sz w:val="22"/>
-                <w:szCs w:val="22"/>
-                <w:u w:val="single"/>
-              </w:rPr>
-              <w:t xml:space="preserve"> S.P.,M.P.</w:t>
+              <w:t>N</w:t>
+            </w:r>
+            <w:r>
+              <w:rPr>
+                <w:rFonts w:ascii="Arial" w:hAnsi="Arial" w:cs="Arial"/>
+                <w:sz w:val="22"/>
+                <w:szCs w:val="22"/>
+              </w:rPr>
+              <w:t>IP</w:t>
+            </w:r>
+            <w:r>
+              <w:rPr>
+                <w:rFonts w:ascii="Arial" w:hAnsi="Arial" w:cs="Arial"/>
+                <w:sz w:val="22"/>
+                <w:szCs w:val="22"/>
+                <w:lang w:val="id-ID"/>
+              </w:rPr>
+              <w:t>. 19</w:t>
+            </w:r>
+            <w:r>
+              <w:rPr>
+                <w:rFonts w:ascii="Arial" w:hAnsi="Arial" w:cs="Arial"/>
+                <w:sz w:val="22"/>
+                <w:szCs w:val="22"/>
+              </w:rPr>
+              <w:t>710227 199903 1 005</w:t>
             </w:r>
           </w:p>
+        </w:tc>
+        <w:tc>
+          <w:tcPr>
+            <w:tcW w:w="5267" w:type="dxa"/>
+            <w:tcMar>
+              <w:left w:w="0" w:type="dxa"/>
+              <w:right w:w="0" w:type="dxa"/>
+            </w:tcMar>
+          </w:tcPr>
           <w:p>
             <w:pPr>
-              <w:jc w:val="center"/>
+              <w:snapToGrid w:val="0"/>
               <w:rPr>
                 <w:rFonts w:ascii="Arial" w:hAnsi="Arial" w:cs="Arial"/>
                 <w:sz w:val="22"/>
                 <w:szCs w:val="22"/>
               </w:rPr>
             </w:pPr>
-            <w:r>
-              <w:rPr>
-                <w:rFonts w:ascii="Arial" w:hAnsi="Arial" w:cs="Arial"/>
-                <w:sz w:val="22"/>
-                <w:szCs w:val="22"/>
-                <w:lang w:val="id-ID"/>
-              </w:rPr>
-              <w:t>N</w:t>
-            </w:r>
-            <w:r>
-              <w:rPr>
-                <w:rFonts w:ascii="Arial" w:hAnsi="Arial" w:cs="Arial"/>
-                <w:sz w:val="22"/>
-                <w:szCs w:val="22"/>
-              </w:rPr>
-              <w:t>IP</w:t>
-            </w:r>
-            <w:r>
-              <w:rPr>
-                <w:rFonts w:ascii="Arial" w:hAnsi="Arial" w:cs="Arial"/>
-                <w:sz w:val="22"/>
-                <w:szCs w:val="22"/>
-                <w:lang w:val="id-ID"/>
-              </w:rPr>
-              <w:t xml:space="preserve">. </w:t>
-            </w:r>
-            <w:r>
-              <w:rPr>
-                <w:rFonts w:ascii="Arial" w:hAnsi="Arial" w:cs="Arial"/>
-                <w:noProof/>
-                <w:sz w:val="22"/>
-                <w:szCs w:val="22"/>
-                <w:lang w:val="id-ID"/>
-              </w:rPr>
-              <w:t>19</w:t>
-            </w:r>
-            <w:r>
-              <w:rPr>
-                <w:rFonts w:ascii="Arial" w:hAnsi="Arial" w:cs="Arial"/>
-                <w:noProof/>
-                <w:sz w:val="22"/>
-                <w:szCs w:val="22"/>
-              </w:rPr>
-              <w:t>710227 199903 1 005</w:t>
-            </w:r>
           </w:p>
         </w:tc>
       </w:tr>
     </w:tbl>
+    <w:p>
+      <w:pPr>
+        <w:pStyle w:val="MSGENFONTSTYLENAMETEMPLATEROLEMSGENFONTSTYLENAMEBYROLEPICTURECAPTION1"/>
+        <w:shd w:val="clear" w:color="auto" w:fill="auto"/>
+        <w:spacing w:line="240" w:lineRule="auto"/>
+        <w:ind w:right="-176"/>
+        <w:rPr>
+          <w:lang w:eastAsia="id-ID"/>
+        </w:rPr>
+      </w:pPr>
+      <w:bookmarkStart w:id="4" w:name="_Hlk136934414"/>
+      <w:bookmarkEnd w:id="4"/>
+    </w:p>
     <w:p/>
     <w:p/>
     <w:sectPr>
@@ -4510,7 +4997,7 @@
     <w:name w:val="MSG_EN_FONT_STYLE_NAME_TEMPLATE_ROLE MSG_EN_FONT_STYLE_NAME_BY_ROLE_PICTURE_CAPTION1"/>
     <w:basedOn w:val="Normal"/>
     <w:link w:val="MSGENFONTSTYLENAMETEMPLATEROLEMSGENFONTSTYLENAMEBYROLEPICTURECAPTION"/>
-    <w:uiPriority w:val="99"/>
+    <w:qFormat/>
     <w:rsid w:val="00356902"/>
     <w:pPr>
       <w:shd w:val="clear" w:color="auto" w:fill="FFFFFF"/>

</xml_diff>